<commit_message>
Documentos OE1-OE3 con el titulo y los objetivos vigentes (respaldo de los originales incluido)
</commit_message>
<xml_diff>
--- a/desarollo/SIMA_OE1_Palma_Palomino.docx
+++ b/desarollo/SIMA_OE1_Palma_Palomino.docx
@@ -364,7 +364,7 @@
           <w:szCs w:val="22"/>
           <w:lang w:val="en-US"/>
         </w:rPr>
-        <w:t>Plataforma de microaprendizaje basada en IA para la generación de contenido educativo personalizado</w:t>
+        <w:t>Notación compacta para la generación verificada de ítems IRT con modelos de lenguaje</w:t>
       </w:r>
     </w:p>
     <w:p xmlns:wp14="http://schemas.microsoft.com/office/word/2010/wordml" wp14:textId="77777777">
@@ -391,7 +391,7 @@
           <w:szCs w:val="22"/>
           <w:lang w:val="en-US"/>
         </w:rPr>
-        <w:t>y evaluaciones adaptativas a partir de clases universitarias grabadas</w:t>
+        <w:t>en una plataforma de microaprendizaje con evaluación adaptativa para la educación universitaria</w:t>
       </w:r>
     </w:p>
     <w:tbl>
@@ -1128,7 +1128,7 @@
           <w:szCs w:val="20"/>
           <w:lang w:val="en-US"/>
         </w:rPr>
-        <w:t>El presente documento corresponde al entregable del primer objetivo específico (OE1) del proyecto "Plataforma de microaprendizaje basada en inteligencia artificial para la generación de contenido educativo personalizado y evaluaciones adaptativas orientadas al seguimiento progresivo del estudiante a partir de clases universitarias grabadas en Perú".</w:t>
+        <w:t>El presente documento corresponde al entregable del primer objetivo específico (OE1) del proyecto "Notación compacta para la generación verificada de ítems IRT con modelos de lenguaje en una plataforma de microaprendizaje con evaluación adaptativa para la educación universitaria".</w:t>
       </w:r>
     </w:p>
     <w:p xmlns:wp14="http://schemas.microsoft.com/office/word/2010/wordml" wp14:textId="77777777">
@@ -1195,7 +1195,7 @@
           <w:szCs w:val="20"/>
           <w:lang w:val="en-US"/>
         </w:rPr>
-        <w:t>"Analizar técnicas, herramientas y frameworks de inteligencia artificial, procesamiento de lenguaje natural, reconocimiento automático de voz y evaluación adaptativa, con el fin de seleccionar los componentes más adecuados para la construcción de una plataforma de microaprendizaje basada en grabaciones de clases universitarias."</w:t>
+        <w:t>"Analizar técnicas, herramientas y frameworks de reconocimiento automático de voz, modelos de lenguaje, formatos de serialización estructurada y evaluación adaptativa, con el fin de seleccionar los componentes de la notación, del pipeline y de la plataforma."</w:t>
       </w:r>
     </w:p>
     <w:p xmlns:wp14="http://schemas.microsoft.com/office/word/2010/wordml" wp14:textId="77777777">

</xml_diff>